<commit_message>
Fix contract schedule and admin dates
</commit_message>
<xml_diff>
--- a/test-output-markers-2.docx
+++ b/test-output-markers-2.docx
@@ -734,6 +734,7 @@
               </w:rPr>
               <w:t>416-555-0100</w:t>
             </w:r>
+            <w:proofErr w:type="gramStart"/>
             <w:r>
               <w:rPr>
                 <w:b/>
@@ -741,6 +742,15 @@
                 <w:sz w:val="22"/>
                 <w:szCs w:val="22"/>
               </w:rPr>
+              <w:t/>
+            </w:r>
+            <w:r>
+              <w:rPr>
+                <w:b/>
+                <w:bCs/>
+                <w:sz w:val="22"/>
+                <w:szCs w:val="22"/>
+              </w:rPr>
               <w:t xml:space="preserve">  </w:t>
             </w:r>
             <w:r>
@@ -750,6 +760,7 @@
               </w:rPr>
               <w:tab/>
             </w:r>
+            <w:proofErr w:type="gramEnd"/>
             <w:r>
               <w:rPr>
                 <w:sz w:val="22"/>
@@ -1243,282 +1254,62 @@
                 <w:szCs w:val="22"/>
               </w:rPr>
             </w:pPr>
-            <w:r>
-              <w:rPr>
-                <w:noProof/>
-                <w:sz w:val="22"/>
-                <w:szCs w:val="22"/>
-              </w:rPr>
-              <mc:AlternateContent>
-                <mc:Choice Requires="wps">
-                  <w:drawing>
-                    <wp:anchor distT="45720" distB="45720" distL="114300" distR="114300" simplePos="0" relativeHeight="251694080" behindDoc="0" locked="0" layoutInCell="1" allowOverlap="1" wp14:anchorId="467DE0D4" wp14:editId="425656E5">
-                      <wp:simplePos x="0" y="0"/>
-                      <wp:positionH relativeFrom="column">
-                        <wp:posOffset>1927390</wp:posOffset>
-                      </wp:positionH>
-                      <wp:positionV relativeFrom="paragraph">
-                        <wp:posOffset>106846</wp:posOffset>
-                      </wp:positionV>
-                      <wp:extent cx="218440" cy="231775"/>
-                      <wp:effectExtent l="0" t="0" r="10160" b="15875"/>
-                      <wp:wrapSquare wrapText="bothSides"/>
-                      <wp:docPr id="1771812289" name="Text Box 2"/>
-                      <wp:cNvGraphicFramePr>
-                        <a:graphicFrameLocks xmlns:a="http://schemas.openxmlformats.org/drawingml/2006/main"/>
-                      </wp:cNvGraphicFramePr>
-                      <a:graphic xmlns:a="http://schemas.openxmlformats.org/drawingml/2006/main">
-                        <a:graphicData uri="http://schemas.microsoft.com/office/word/2010/wordprocessingShape">
-                          <wps:wsp>
-                            <wps:cNvSpPr txBox="1">
-                              <a:spLocks noChangeArrowheads="1"/>
-                            </wps:cNvSpPr>
-                            <wps:spPr bwMode="auto">
-                              <a:xfrm>
-                                <a:off x="0" y="0"/>
-                                <a:ext cx="218440" cy="231775"/>
-                              </a:xfrm>
-                              <a:prstGeom prst="rect">
-                                <a:avLst/>
-                              </a:prstGeom>
-                              <a:solidFill>
-                                <a:srgbClr val="FFFFFF"/>
-                              </a:solidFill>
-                              <a:ln w="9525">
-                                <a:solidFill>
-                                  <a:srgbClr val="000000"/>
-                                </a:solidFill>
-                                <a:miter lim="800000"/>
-                                <a:headEnd/>
-                                <a:tailEnd/>
-                              </a:ln>
-                            </wps:spPr>
-                            <wps:txbx>
-                              <w:txbxContent>
-                                <w:p>
-                                  <w:pPr>
-                                    <w:rPr>
-                                      <w:b/>
-                                      <w:bCs/>
-                                      <w:sz w:val="20"/>
-                                      <w:szCs w:val="20"/>
-                                    </w:rPr>
-                                  </w:pPr>
-                                </w:p>
-                              </w:txbxContent>
-                            </wps:txbx>
-                            <wps:bodyPr rot="0" vert="horz" wrap="square" lIns="91440" tIns="45720" rIns="91440" bIns="45720" anchor="t" anchorCtr="0">
-                              <a:noAutofit/>
-                            </wps:bodyPr>
-                          </wps:wsp>
-                        </a:graphicData>
-                      </a:graphic>
-                      <wp14:sizeRelH relativeFrom="margin">
-                        <wp14:pctWidth>0</wp14:pctWidth>
-                      </wp14:sizeRelH>
-                      <wp14:sizeRelV relativeFrom="margin">
-                        <wp14:pctHeight>0</wp14:pctHeight>
-                      </wp14:sizeRelV>
-                    </wp:anchor>
-                  </w:drawing>
-                </mc:Choice>
-                <mc:Fallback>
-                  <w:pict>
-                    <v:shapetype w14:anchorId="467DE0D4" id="_x0000_t202" coordsize="21600,21600" o:spt="202" path="m,l,21600r21600,l21600,xe">
-                      <v:stroke joinstyle="miter"/>
-                      <v:path gradientshapeok="t" o:connecttype="rect"/>
-                    </v:shapetype>
-                    <v:shape id="Text Box 2" o:spid="_x0000_s1026" type="#_x0000_t202" style="position:absolute;margin-left:151.75pt;margin-top:8.4pt;width:17.2pt;height:18.25pt;z-index:251694080;visibility:visible;mso-wrap-style:square;mso-width-percent:0;mso-height-percent:0;mso-wrap-distance-left:9pt;mso-wrap-distance-top:3.6pt;mso-wrap-distance-right:9pt;mso-wrap-distance-bottom:3.6pt;mso-position-horizontal:absolute;mso-position-horizontal-relative:text;mso-position-vertical:absolute;mso-position-vertical-relative:text;mso-width-percent:0;mso-height-percent:0;mso-width-relative:margin;mso-height-relative:margin;v-text-anchor:top" o:gfxdata="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">
-                      <v:textbox>
-                        <w:txbxContent>
-                          <w:p>
-                            <w:pPr>
-                              <w:rPr>
-                                <w:b/>
-                                <w:bCs/>
-                                <w:sz w:val="20"/>
-                                <w:szCs w:val="20"/>
-                              </w:rPr>
-                            </w:pPr>
-                          </w:p>
-                        </w:txbxContent>
-                      </v:textbox>
-                      <w10:wrap type="square"/>
-                    </v:shape>
-                  </w:pict>
-                </mc:Fallback>
-              </mc:AlternateContent>
-            </w:r>
-            <w:r>
-              <w:rPr>
-                <w:noProof/>
-                <w:sz w:val="22"/>
-                <w:szCs w:val="22"/>
-              </w:rPr>
-              <mc:AlternateContent>
-                <mc:Choice Requires="wps">
-                  <w:drawing>
-                    <wp:anchor distT="45720" distB="45720" distL="114300" distR="114300" simplePos="0" relativeHeight="251665408" behindDoc="0" locked="0" layoutInCell="1" allowOverlap="1" wp14:anchorId="1737E518" wp14:editId="592AD27E">
-                      <wp:simplePos x="0" y="0"/>
-                      <wp:positionH relativeFrom="column">
-                        <wp:posOffset>3350205</wp:posOffset>
-                      </wp:positionH>
-                      <wp:positionV relativeFrom="paragraph">
-                        <wp:posOffset>122141</wp:posOffset>
-                      </wp:positionV>
-                      <wp:extent cx="218440" cy="231775"/>
-                      <wp:effectExtent l="0" t="0" r="10160" b="15875"/>
-                      <wp:wrapSquare wrapText="bothSides"/>
-                      <wp:docPr id="1126634135" name="Text Box 2"/>
-                      <wp:cNvGraphicFramePr>
-                        <a:graphicFrameLocks xmlns:a="http://schemas.openxmlformats.org/drawingml/2006/main"/>
-                      </wp:cNvGraphicFramePr>
-                      <a:graphic xmlns:a="http://schemas.openxmlformats.org/drawingml/2006/main">
-                        <a:graphicData uri="http://schemas.microsoft.com/office/word/2010/wordprocessingShape">
-                          <wps:wsp>
-                            <wps:cNvSpPr txBox="1">
-                              <a:spLocks noChangeArrowheads="1"/>
-                            </wps:cNvSpPr>
-                            <wps:spPr bwMode="auto">
-                              <a:xfrm>
-                                <a:off x="0" y="0"/>
-                                <a:ext cx="218440" cy="231775"/>
-                              </a:xfrm>
-                              <a:prstGeom prst="rect">
-                                <a:avLst/>
-                              </a:prstGeom>
-                              <a:solidFill>
-                                <a:srgbClr val="FFFFFF"/>
-                              </a:solidFill>
-                              <a:ln w="9525">
-                                <a:solidFill>
-                                  <a:srgbClr val="000000"/>
-                                </a:solidFill>
-                                <a:miter lim="800000"/>
-                                <a:headEnd/>
-                                <a:tailEnd/>
-                              </a:ln>
-                            </wps:spPr>
-                            <wps:txbx>
-                              <w:txbxContent>
-                                <w:p>
-                                  <w:pPr>
-                                    <w:rPr>
-                                      <w:b/>
-                                      <w:bCs/>
-                                      <w:sz w:val="20"/>
-                                      <w:szCs w:val="20"/>
-                                    </w:rPr>
-                                  </w:pPr>
-                                  <w:r>
-                                    <w:rPr>
-                                      <w:b/>
-                                      <w:bCs/>
-                                      <w:sz w:val="20"/>
-                                      <w:szCs w:val="20"/>
-                                    </w:rPr>
-                                    <w:t>X</w:t>
-                                  </w:r>
-                                </w:p>
-                              </w:txbxContent>
-                            </wps:txbx>
-                            <wps:bodyPr rot="0" vert="horz" wrap="square" lIns="91440" tIns="45720" rIns="91440" bIns="45720" anchor="t" anchorCtr="0">
-                              <a:noAutofit/>
-                            </wps:bodyPr>
-                          </wps:wsp>
-                        </a:graphicData>
-                      </a:graphic>
-                      <wp14:sizeRelH relativeFrom="margin">
-                        <wp14:pctWidth>0</wp14:pctWidth>
-                      </wp14:sizeRelH>
-                      <wp14:sizeRelV relativeFrom="margin">
-                        <wp14:pctHeight>0</wp14:pctHeight>
-                      </wp14:sizeRelV>
-                    </wp:anchor>
-                  </w:drawing>
-                </mc:Choice>
-                <mc:Fallback>
-                  <w:pict>
-                    <v:shape w14:anchorId="1737E518" id="_x0000_s1027" type="#_x0000_t202" style="position:absolute;margin-left:263.8pt;margin-top:9.6pt;width:17.2pt;height:18.25pt;z-index:251665408;visibility:visible;mso-wrap-style:square;mso-width-percent:0;mso-height-percent:0;mso-wrap-distance-left:9pt;mso-wrap-distance-top:3.6pt;mso-wrap-distance-right:9pt;mso-wrap-distance-bottom:3.6pt;mso-position-horizontal:absolute;mso-position-horizontal-relative:text;mso-position-vertical:absolute;mso-position-vertical-relative:text;mso-width-percent:0;mso-height-percent:0;mso-width-relative:margin;mso-height-relative:margin;v-text-anchor:top" o:gfxdata="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">
-                      <v:textbox>
-                        <w:txbxContent>
-                          <w:p>
-                            <w:pPr>
-                              <w:rPr>
-                                <w:b/>
-                                <w:bCs/>
-                                <w:sz w:val="20"/>
-                                <w:szCs w:val="20"/>
-                              </w:rPr>
-                            </w:pPr>
-                            <w:r>
-                              <w:rPr>
-                                <w:b/>
-                                <w:bCs/>
-                                <w:sz w:val="20"/>
-                                <w:szCs w:val="20"/>
-                              </w:rPr>
-                              <w:t>X</w:t>
-                            </w:r>
-                          </w:p>
-                        </w:txbxContent>
-                      </v:textbox>
-                      <w10:wrap type="square"/>
-                    </v:shape>
-                  </w:pict>
-                </mc:Fallback>
-              </mc:AlternateContent>
-            </w:r>
-          </w:p>
-          <w:p>
-            <w:pPr>
-              <w:pStyle w:val="Default"/>
-              <w:rPr>
-                <w:sz w:val="22"/>
-                <w:szCs w:val="22"/>
-              </w:rPr>
-            </w:pPr>
-            <w:r>
-              <w:rPr>
-                <w:sz w:val="22"/>
-                <w:szCs w:val="22"/>
-              </w:rPr>
-              <w:t xml:space="preserve">International Student:  </w:t>
-            </w:r>
-            <w:r>
-              <w:rPr>
-                <w:sz w:val="22"/>
-                <w:szCs w:val="22"/>
-              </w:rPr>
-              <w:t xml:space="preserve">☐ Yes</w:t>
-            </w:r>
-            <w:r>
-              <w:rPr>
-                <w:sz w:val="22"/>
-                <w:szCs w:val="22"/>
-              </w:rPr>
-              <w:tab/>
-            </w:r>
-            <w:r>
-              <w:rPr>
-                <w:sz w:val="22"/>
-                <w:szCs w:val="22"/>
-              </w:rPr>
-              <w:tab/>
-            </w:r>
-            <w:r>
-              <w:rPr>
-                <w:sz w:val="22"/>
-                <w:szCs w:val="22"/>
-              </w:rPr>
-              <w:tab/>
-            </w:r>
-            <w:r>
-              <w:rPr>
-                <w:sz w:val="22"/>
-                <w:szCs w:val="22"/>
-              </w:rPr>
-              <w:t xml:space="preserve">☒ No</w:t>
+          </w:p>
+          <w:p>
+            <w:pPr>
+              <w:pStyle w:val="Default"/>
+              <w:rPr>
+                <w:sz w:val="22"/>
+                <w:szCs w:val="22"/>
+              </w:rPr>
+            </w:pPr>
+            <w:r>
+              <w:rPr>
+                <w:sz w:val="22"/>
+                <w:szCs w:val="22"/>
+              </w:rPr>
+              <w:t xml:space="preserve">International Student: [ ]</w:t>
+            </w:r>
+            <w:proofErr w:type="spellStart"/>
+            <w:r>
+              <w:rPr>
+                <w:sz w:val="22"/>
+                <w:szCs w:val="22"/>
+              </w:rPr>
+              <w:t/>
+            </w:r>
+            <w:proofErr w:type="spellEnd"/>
+            <w:r>
+              <w:rPr>
+                <w:sz w:val="22"/>
+                <w:szCs w:val="22"/>
+              </w:rPr>
+              <w:t xml:space="preserve"> Yes     </w:t>
+            </w:r>
+            <w:proofErr w:type="gramStart"/>
+            <w:r>
+              <w:rPr>
+                <w:sz w:val="22"/>
+                <w:szCs w:val="22"/>
+              </w:rPr>
+              <w:t xml:space="preserve">   [X]</w:t>
+            </w:r>
+            <w:proofErr w:type="spellStart"/>
+            <w:proofErr w:type="gramEnd"/>
+            <w:r>
+              <w:rPr>
+                <w:sz w:val="22"/>
+                <w:szCs w:val="22"/>
+              </w:rPr>
+              <w:t/>
+            </w:r>
+            <w:proofErr w:type="spellEnd"/>
+            <w:r>
+              <w:rPr>
+                <w:sz w:val="22"/>
+                <w:szCs w:val="22"/>
+              </w:rPr>
+              <w:t xml:space="preserve"> No</w:t>
             </w:r>
           </w:p>
           <w:p>
@@ -2308,7 +2099,27 @@
                 <w:sz w:val="28"/>
                 <w:szCs w:val="28"/>
               </w:rPr>
-              <w:t xml:space="preserve">25 Watline Avenue, Unit 204 </w:t>
+              <w:t xml:space="preserve">25 Watline Avenue, Unit 204</w:t>
+            </w:r>
+            <w:proofErr w:type="spellStart"/>
+            <w:r>
+              <w:rPr>
+                <w:b/>
+                <w:bCs/>
+                <w:sz w:val="28"/>
+                <w:szCs w:val="28"/>
+              </w:rPr>
+              <w:t/>
+            </w:r>
+            <w:proofErr w:type="spellEnd"/>
+            <w:r>
+              <w:rPr>
+                <w:b/>
+                <w:bCs/>
+                <w:sz w:val="28"/>
+                <w:szCs w:val="28"/>
+              </w:rPr>
+              <w:t xml:space="preserve"> </w:t>
             </w:r>
           </w:p>
           <w:p>
@@ -3024,7 +2835,7 @@
                       <w:sz w:val="22"/>
                       <w:szCs w:val="22"/>
                     </w:rPr>
-                    <w:t>8:00AM-2:00PM</w:t>
+                    <w:t>8:00 AM to 2:00 PM</w:t>
                   </w:r>
                 </w:p>
               </w:tc>
@@ -3047,7 +2858,7 @@
                       <w:sz w:val="22"/>
                       <w:szCs w:val="22"/>
                     </w:rPr>
-                    <w:t>8:00AM-2:00PM</w:t>
+                    <w:t>8:00 AM to 2:00 PM</w:t>
                   </w:r>
                 </w:p>
               </w:tc>
@@ -3070,7 +2881,7 @@
                       <w:sz w:val="22"/>
                       <w:szCs w:val="22"/>
                     </w:rPr>
-                    <w:t>8:00AM-2:00PM</w:t>
+                    <w:t>8:00 AM to 2:00 PM</w:t>
                   </w:r>
                 </w:p>
               </w:tc>
@@ -3093,7 +2904,7 @@
                       <w:sz w:val="22"/>
                       <w:szCs w:val="22"/>
                     </w:rPr>
-                    <w:t>8:00AM-2:00PM</w:t>
+                    <w:t>8:00 AM to 2:00 PM</w:t>
                   </w:r>
                 </w:p>
               </w:tc>
@@ -3118,7 +2929,7 @@
                       <w:sz w:val="22"/>
                       <w:szCs w:val="22"/>
                     </w:rPr>
-                    <w:t>8:00AM-2:00PM</w:t>
+                    <w:t>8:00 AM to 2:00 PM</w:t>
                   </w:r>
                 </w:p>
               </w:tc>
@@ -3886,174 +3697,76 @@
             </w:pPr>
             <w:r>
               <w:rPr>
-                <w:noProof/>
-                <w:sz w:val="22"/>
-                <w:szCs w:val="22"/>
-              </w:rPr>
-              <mc:AlternateContent>
-                <mc:Choice Requires="wps">
-                  <w:drawing>
-                    <wp:anchor distT="45720" distB="45720" distL="114300" distR="114300" simplePos="0" relativeHeight="251669504" behindDoc="0" locked="0" layoutInCell="1" allowOverlap="1" wp14:anchorId="3C7F2D48" wp14:editId="3DDD7C8B">
-                      <wp:simplePos x="0" y="0"/>
-                      <wp:positionH relativeFrom="column">
-                        <wp:posOffset>2817826</wp:posOffset>
-                      </wp:positionH>
-                      <wp:positionV relativeFrom="paragraph">
-                        <wp:posOffset>122389</wp:posOffset>
-                      </wp:positionV>
-                      <wp:extent cx="218440" cy="231775"/>
-                      <wp:effectExtent l="0" t="0" r="10160" b="15875"/>
-                      <wp:wrapSquare wrapText="bothSides"/>
-                      <wp:docPr id="751020824" name="Text Box 2"/>
-                      <wp:cNvGraphicFramePr>
-                        <a:graphicFrameLocks xmlns:a="http://schemas.openxmlformats.org/drawingml/2006/main"/>
-                      </wp:cNvGraphicFramePr>
-                      <a:graphic xmlns:a="http://schemas.openxmlformats.org/drawingml/2006/main">
-                        <a:graphicData uri="http://schemas.microsoft.com/office/word/2010/wordprocessingShape">
-                          <wps:wsp>
-                            <wps:cNvSpPr txBox="1">
-                              <a:spLocks noChangeArrowheads="1"/>
-                            </wps:cNvSpPr>
-                            <wps:spPr bwMode="auto">
-                              <a:xfrm>
-                                <a:off x="0" y="0"/>
-                                <a:ext cx="218440" cy="231775"/>
-                              </a:xfrm>
-                              <a:prstGeom prst="rect">
-                                <a:avLst/>
-                              </a:prstGeom>
-                              <a:solidFill>
-                                <a:srgbClr val="FFFFFF"/>
-                              </a:solidFill>
-                              <a:ln w="9525">
-                                <a:solidFill>
-                                  <a:srgbClr val="000000"/>
-                                </a:solidFill>
-                                <a:miter lim="800000"/>
-                                <a:headEnd/>
-                                <a:tailEnd/>
-                              </a:ln>
-                            </wps:spPr>
-                            <wps:txbx>
-                              <w:txbxContent>
-                                <w:p>
-                                  <w:pPr>
-                                    <w:rPr>
-                                      <w:b/>
-                                      <w:bCs/>
-                                      <w:sz w:val="20"/>
-                                      <w:szCs w:val="20"/>
-                                    </w:rPr>
-                                  </w:pPr>
-                                  <w:r>
-                                    <w:rPr>
-                                      <w:b/>
-                                      <w:bCs/>
-                                      <w:sz w:val="20"/>
-                                      <w:szCs w:val="20"/>
-                                    </w:rPr>
-                                    <w:t>X</w:t>
-                                  </w:r>
-                                </w:p>
-                              </w:txbxContent>
-                            </wps:txbx>
-                            <wps:bodyPr rot="0" vert="horz" wrap="square" lIns="91440" tIns="45720" rIns="91440" bIns="45720" anchor="t" anchorCtr="0">
-                              <a:noAutofit/>
-                            </wps:bodyPr>
-                          </wps:wsp>
-                        </a:graphicData>
-                      </a:graphic>
-                      <wp14:sizeRelH relativeFrom="margin">
-                        <wp14:pctWidth>0</wp14:pctWidth>
-                      </wp14:sizeRelH>
-                      <wp14:sizeRelV relativeFrom="margin">
-                        <wp14:pctHeight>0</wp14:pctHeight>
-                      </wp14:sizeRelV>
-                    </wp:anchor>
-                  </w:drawing>
-                </mc:Choice>
-                <mc:Fallback>
-                  <w:pict>
-                    <v:shape w14:anchorId="3C7F2D48" id="_x0000_s1030" type="#_x0000_t202" style="position:absolute;margin-left:221.9pt;margin-top:9.65pt;width:17.2pt;height:18.25pt;z-index:251669504;visibility:visible;mso-wrap-style:square;mso-width-percent:0;mso-height-percent:0;mso-wrap-distance-left:9pt;mso-wrap-distance-top:3.6pt;mso-wrap-distance-right:9pt;mso-wrap-distance-bottom:3.6pt;mso-position-horizontal:absolute;mso-position-horizontal-relative:text;mso-position-vertical:absolute;mso-position-vertical-relative:text;mso-width-percent:0;mso-height-percent:0;mso-width-relative:margin;mso-height-relative:margin;v-text-anchor:top" o:gfxdata="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">
-                      <v:textbox>
-                        <w:txbxContent>
-                          <w:p>
-                            <w:pPr>
-                              <w:rPr>
-                                <w:b/>
-                                <w:bCs/>
-                                <w:sz w:val="20"/>
-                                <w:szCs w:val="20"/>
-                              </w:rPr>
-                            </w:pPr>
-                            <w:r>
-                              <w:rPr>
-                                <w:b/>
-                                <w:bCs/>
-                                <w:sz w:val="20"/>
-                                <w:szCs w:val="20"/>
-                              </w:rPr>
-                              <w:t>X</w:t>
-                            </w:r>
-                          </w:p>
-                        </w:txbxContent>
-                      </v:textbox>
-                      <w10:wrap type="square"/>
-                    </v:shape>
-                  </w:pict>
-                </mc:Fallback>
-              </mc:AlternateContent>
-            </w:r>
-          </w:p>
-          <w:p>
-            <w:pPr>
-              <w:pStyle w:val="Default"/>
-              <w:rPr>
-                <w:sz w:val="22"/>
-                <w:szCs w:val="22"/>
-              </w:rPr>
-            </w:pPr>
-            <w:r>
-              <w:rPr>
-                <w:sz w:val="22"/>
-                <w:szCs w:val="22"/>
-              </w:rPr>
-              <w:t xml:space="preserve">Method of program delivery  </w:t>
-            </w:r>
-            <w:r>
-              <w:rPr>
-                <w:sz w:val="22"/>
-                <w:szCs w:val="22"/>
-              </w:rPr>
-              <w:t xml:space="preserve">☐ in-person</w:t>
-            </w:r>
-            <w:r>
-              <w:rPr>
-                <w:sz w:val="22"/>
-                <w:szCs w:val="22"/>
-              </w:rPr>
-              <w:t xml:space="preserve">    </w:t>
-            </w:r>
-            <w:r>
-              <w:rPr>
-                <w:sz w:val="22"/>
-                <w:szCs w:val="22"/>
-              </w:rPr>
-              <w:t xml:space="preserve">☐ Hybrid</w:t>
-            </w:r>
-            <w:r>
-              <w:rPr>
-                <w:sz w:val="22"/>
-                <w:szCs w:val="22"/>
-              </w:rPr>
-              <w:t xml:space="preserve">      </w:t>
-            </w:r>
-            <w:r>
-              <w:rPr>
-                <w:sz w:val="22"/>
-                <w:szCs w:val="22"/>
-              </w:rPr>
-              <w:t xml:space="preserve">☒ Online</w:t>
+                <w:sz w:val="22"/>
+                <w:szCs w:val="22"/>
+              </w:rPr>
+              <w:t>Method of program delivery</w:t>
+            </w:r>
+            <w:proofErr w:type="gramStart"/>
+            <w:r>
+              <w:rPr>
+                <w:sz w:val="22"/>
+                <w:szCs w:val="22"/>
+              </w:rPr>
+              <w:t xml:space="preserve">   [ ]</w:t>
+            </w:r>
+            <w:proofErr w:type="spellStart"/>
+            <w:proofErr w:type="gramEnd"/>
+            <w:r>
+              <w:rPr>
+                <w:sz w:val="22"/>
+                <w:szCs w:val="22"/>
+              </w:rPr>
+              <w:t/>
+            </w:r>
+            <w:proofErr w:type="spellEnd"/>
+            <w:r>
+              <w:rPr>
+                <w:sz w:val="22"/>
+                <w:szCs w:val="22"/>
+              </w:rPr>
+              <w:t xml:space="preserve"> in-</w:t>
+            </w:r>
+            <w:proofErr w:type="gramStart"/>
+            <w:r>
+              <w:rPr>
+                <w:sz w:val="22"/>
+                <w:szCs w:val="22"/>
+              </w:rPr>
+              <w:t xml:space="preserve">person  [ ]</w:t>
+            </w:r>
+            <w:proofErr w:type="spellStart"/>
+            <w:proofErr w:type="gramEnd"/>
+            <w:r>
+              <w:rPr>
+                <w:sz w:val="22"/>
+                <w:szCs w:val="22"/>
+              </w:rPr>
+              <w:t/>
+            </w:r>
+            <w:proofErr w:type="spellEnd"/>
+            <w:r>
+              <w:rPr>
+                <w:sz w:val="22"/>
+                <w:szCs w:val="22"/>
+              </w:rPr>
+              <w:t xml:space="preserve"> Hybrid [X]</w:t>
+            </w:r>
+            <w:proofErr w:type="spellStart"/>
+            <w:r>
+              <w:rPr>
+                <w:sz w:val="22"/>
+                <w:szCs w:val="22"/>
+              </w:rPr>
+              <w:t/>
+            </w:r>
+            <w:proofErr w:type="spellEnd"/>
+            <w:r>
+              <w:rPr>
+                <w:sz w:val="22"/>
+                <w:szCs w:val="22"/>
+              </w:rPr>
+              <w:t xml:space="preserve"> Online</w:t>
             </w:r>
           </w:p>
           <w:p>
@@ -4167,7 +3880,7 @@
               </w:rPr>
               <w:t xml:space="preserve">International Student and/or Applicant with foreign credentials. All foreign credentials must be translated into English and compared for Grade 12 equivalency by a recognized organization such as World Education Services: </w:t>
             </w:r>
-            <w:hyperlink r:id="rId10" w:history="1">
+            <w:hyperlink r:id="rId8" w:history="1">
               <w:r>
                 <w:rPr>
                   <w:rStyle w:val="Hyperlink"/>
@@ -4240,15 +3953,18 @@
           <w:p>
             <w:pPr>
               <w:pStyle w:val="Default"/>
+              <w:ind w:left="720"/>
               <w:rPr>
                 <w:b/>
                 <w:bCs/>
                 <w:sz w:val="22"/>
                 <w:szCs w:val="22"/>
-                <w:u w:val="single"/>
-              </w:rPr>
-            </w:pPr>
-            <w:r>
+              </w:rPr>
+            </w:pPr>
+          </w:p>
+          <w:p>
+            <w:pPr>
+              <w:pStyle w:val="Default"/>
               <w:rPr>
                 <w:b/>
                 <w:bCs/>
@@ -4256,7 +3972,27 @@
                 <w:szCs w:val="22"/>
                 <w:u w:val="single"/>
               </w:rPr>
-              <w:br w:type="page"/>
+            </w:pPr>
+          </w:p>
+          <w:p>
+            <w:pPr>
+              <w:pStyle w:val="Default"/>
+              <w:rPr>
+                <w:b/>
+                <w:bCs/>
+                <w:sz w:val="22"/>
+                <w:szCs w:val="22"/>
+                <w:u w:val="single"/>
+              </w:rPr>
+            </w:pPr>
+            <w:r>
+              <w:rPr>
+                <w:b/>
+                <w:bCs/>
+                <w:sz w:val="22"/>
+                <w:szCs w:val="22"/>
+                <w:u w:val="single"/>
+              </w:rPr>
               <w:t>English Language Proficiency</w:t>
             </w:r>
           </w:p>
@@ -4586,6 +4322,7 @@
               </w:rPr>
               <w:t xml:space="preserve">            </w:t>
             </w:r>
+            <w:proofErr w:type="gramStart"/>
             <w:r>
               <w:rPr>
                 <w:sz w:val="22"/>
@@ -4613,6 +4350,14 @@
                 <w:szCs w:val="22"/>
               </w:rPr>
               <w:t>___5,365______________</w:t>
+            </w:r>
+            <w:proofErr w:type="gramEnd"/>
+            <w:r>
+              <w:rPr>
+                <w:sz w:val="22"/>
+                <w:szCs w:val="22"/>
+              </w:rPr>
+              <w:t/>
             </w:r>
             <w:r>
               <w:rPr>
@@ -5448,7 +5193,6 @@
                 <w:szCs w:val="28"/>
                 <w:u w:val="single"/>
               </w:rPr>
-              <w:lastRenderedPageBreak/>
               <w:t>Payment Schedule</w:t>
             </w:r>
           </w:p>
@@ -8309,6 +8053,7 @@
               </w:rPr>
               <w:t xml:space="preserve">(Signature of </w:t>
             </w:r>
+            <w:proofErr w:type="gramStart"/>
             <w:r>
               <w:rPr>
                 <w:sz w:val="22"/>
@@ -8328,7 +8073,15 @@
                 <w:sz w:val="22"/>
                 <w:szCs w:val="22"/>
               </w:rPr>
-              <w:t xml:space="preserve">                                                                 Date</w:t>
+              <w:t xml:space="preserve"> </w:t>
+            </w:r>
+            <w:proofErr w:type="gramEnd"/>
+            <w:r>
+              <w:rPr>
+                <w:sz w:val="22"/>
+                <w:szCs w:val="22"/>
+              </w:rPr>
+              <w:t xml:space="preserve">                                                                Date</w:t>
             </w:r>
             <w:r>
               <w:rPr>
@@ -8828,6 +8581,7 @@
               </w:rPr>
               <w:t xml:space="preserve">(Signature of </w:t>
             </w:r>
+            <w:proofErr w:type="gramStart"/>
             <w:r>
               <w:rPr>
                 <w:sz w:val="22"/>
@@ -8847,7 +8601,15 @@
                 <w:sz w:val="22"/>
                 <w:szCs w:val="22"/>
               </w:rPr>
-              <w:t xml:space="preserve">                                </w:t>
+              <w:t xml:space="preserve"> </w:t>
+            </w:r>
+            <w:proofErr w:type="gramEnd"/>
+            <w:r>
+              <w:rPr>
+                <w:sz w:val="22"/>
+                <w:szCs w:val="22"/>
+              </w:rPr>
+              <w:t xml:space="preserve">                               </w:t>
             </w:r>
             <w:r>
               <w:rPr>
@@ -8875,7 +8637,23 @@
                 <w:sz w:val="22"/>
                 <w:szCs w:val="22"/>
               </w:rPr>
-              <w:t xml:space="preserve">           (Date)</w:t>
+              <w:t xml:space="preserve">        </w:t>
+            </w:r>
+            <w:proofErr w:type="gramStart"/>
+            <w:r>
+              <w:rPr>
+                <w:sz w:val="22"/>
+                <w:szCs w:val="22"/>
+              </w:rPr>
+              <w:t xml:space="preserve">   (</w:t>
+            </w:r>
+            <w:proofErr w:type="gramEnd"/>
+            <w:r>
+              <w:rPr>
+                <w:sz w:val="22"/>
+                <w:szCs w:val="22"/>
+              </w:rPr>
+              <w:t>Date)</w:t>
             </w:r>
           </w:p>
           <w:p>
@@ -9132,6 +8910,7 @@
               </w:rPr>
               <w:t xml:space="preserve">      (Signature of Admission Officer, Registrar, </w:t>
             </w:r>
+            <w:proofErr w:type="gramStart"/>
             <w:r>
               <w:rPr>
                 <w:sz w:val="22"/>
@@ -9151,7 +8930,15 @@
                 <w:sz w:val="22"/>
                 <w:szCs w:val="22"/>
               </w:rPr>
-              <w:t xml:space="preserve">                                  Date</w:t>
+              <w:t xml:space="preserve"> </w:t>
+            </w:r>
+            <w:proofErr w:type="gramEnd"/>
+            <w:r>
+              <w:rPr>
+                <w:sz w:val="22"/>
+                <w:szCs w:val="22"/>
+              </w:rPr>
+              <w:t xml:space="preserve">                                 Date: 26/05/2026</w:t>
             </w:r>
           </w:p>
           <w:p>
@@ -9732,7 +9519,23 @@
                 <w:sz w:val="22"/>
                 <w:szCs w:val="22"/>
               </w:rPr>
-              <w:t>I understand that I can refuse to sign this consent form and that I can withdraw my consent at any time for future uses of my personal information by writing to the Chief Operating Officer at 25 Watline Avenue, Unit 204 Mississauga, Ontario, L4Z 2Z1. I understand that if I refuse or withdraw my consent the Superintendent may not be able to contact me to inform me of my rights under the Act or collect information to help potential students make informed decisions about their educational choices.</w:t>
+              <w:t xml:space="preserve">I understand that I can refuse to sign this consent form and that I can withdraw my consent at any time for future uses of my personal information by writing to the Chief Operating Officer at 25 </w:t>
+            </w:r>
+            <w:proofErr w:type="spellStart"/>
+            <w:r>
+              <w:rPr>
+                <w:sz w:val="22"/>
+                <w:szCs w:val="22"/>
+              </w:rPr>
+              <w:t>Watline</w:t>
+            </w:r>
+            <w:proofErr w:type="spellEnd"/>
+            <w:r>
+              <w:rPr>
+                <w:sz w:val="22"/>
+                <w:szCs w:val="22"/>
+              </w:rPr>
+              <w:t xml:space="preserve"> Avenue, Unit 204 Mississauga, Ontario, L4Z 2Z1. I understand that if I refuse or withdraw my consent the Superintendent may not be able to contact me to inform me of my rights under the Act or collect information to help potential students make informed decisions about their educational choices.</w:t>
             </w:r>
           </w:p>
           <w:p>
@@ -9978,6 +9781,7 @@
               </w:rPr>
               <w:t xml:space="preserve">(Signature of </w:t>
             </w:r>
+            <w:proofErr w:type="gramStart"/>
             <w:r>
               <w:rPr>
                 <w:sz w:val="22"/>
@@ -9990,7 +9794,15 @@
                 <w:sz w:val="22"/>
                 <w:szCs w:val="22"/>
               </w:rPr>
-              <w:t xml:space="preserve">                                                  </w:t>
+              <w:t xml:space="preserve"> </w:t>
+            </w:r>
+            <w:proofErr w:type="gramEnd"/>
+            <w:r>
+              <w:rPr>
+                <w:sz w:val="22"/>
+                <w:szCs w:val="22"/>
+              </w:rPr>
+              <w:t xml:space="preserve">                                                 </w:t>
             </w:r>
             <w:r>
               <w:rPr>
@@ -10004,7 +9816,23 @@
                 <w:sz w:val="22"/>
                 <w:szCs w:val="22"/>
               </w:rPr>
-              <w:t xml:space="preserve">     (Date)</w:t>
+              <w:t xml:space="preserve">  </w:t>
+            </w:r>
+            <w:proofErr w:type="gramStart"/>
+            <w:r>
+              <w:rPr>
+                <w:sz w:val="22"/>
+                <w:szCs w:val="22"/>
+              </w:rPr>
+              <w:t xml:space="preserve">   (</w:t>
+            </w:r>
+            <w:proofErr w:type="gramEnd"/>
+            <w:r>
+              <w:rPr>
+                <w:sz w:val="22"/>
+                <w:szCs w:val="22"/>
+              </w:rPr>
+              <w:t>Date)</w:t>
             </w:r>
           </w:p>
           <w:p>
@@ -10258,7 +10086,23 @@
                 <w:sz w:val="22"/>
                 <w:szCs w:val="22"/>
               </w:rPr>
-              <w:t xml:space="preserve"> mid-point” means the point in the progress of a vocational program where half of the scheduled hours of instruction for the program have taken place; (“mi-parcours du programme”) </w:t>
+              <w:t xml:space="preserve"> mid-point” means the point in the progress of a vocational program where half of the scheduled hours of instruction for the program have taken place; (“mi-</w:t>
+            </w:r>
+            <w:proofErr w:type="spellStart"/>
+            <w:r>
+              <w:rPr>
+                <w:sz w:val="22"/>
+                <w:szCs w:val="22"/>
+              </w:rPr>
+              <w:t>parcours</w:t>
+            </w:r>
+            <w:proofErr w:type="spellEnd"/>
+            <w:r>
+              <w:rPr>
+                <w:sz w:val="22"/>
+                <w:szCs w:val="22"/>
+              </w:rPr>
+              <w:t xml:space="preserve"> du programme”) </w:t>
             </w:r>
           </w:p>
           <w:p>
@@ -10338,7 +10182,23 @@
                 <w:sz w:val="22"/>
                 <w:szCs w:val="22"/>
               </w:rPr>
-              <w:t xml:space="preserve">25. If a student has entered into a contract with a career college for a vocational program, the college shall give a refund of all fees paid for the program in the following circumstances: </w:t>
+              <w:t xml:space="preserve">25. If a student has </w:t>
+            </w:r>
+            <w:proofErr w:type="gramStart"/>
+            <w:r>
+              <w:rPr>
+                <w:sz w:val="22"/>
+                <w:szCs w:val="22"/>
+              </w:rPr>
+              <w:t>entered into</w:t>
+            </w:r>
+            <w:proofErr w:type="gramEnd"/>
+            <w:r>
+              <w:rPr>
+                <w:sz w:val="22"/>
+                <w:szCs w:val="22"/>
+              </w:rPr>
+              <w:t xml:space="preserve"> a contract with a career college for a vocational program, the college shall give a refund of all fees paid for the program in the following circumstances: </w:t>
             </w:r>
           </w:p>
           <w:p>
@@ -10463,7 +10323,23 @@
                 <w:sz w:val="22"/>
                 <w:szCs w:val="22"/>
               </w:rPr>
-              <w:t xml:space="preserve">5.The college collects any fees other than a service fee before the student has entered into a contract with the college. </w:t>
+              <w:t xml:space="preserve">5.The college collects any fees other than a service fee before the student has </w:t>
+            </w:r>
+            <w:proofErr w:type="gramStart"/>
+            <w:r>
+              <w:rPr>
+                <w:sz w:val="22"/>
+                <w:szCs w:val="22"/>
+              </w:rPr>
+              <w:t>entered into</w:t>
+            </w:r>
+            <w:proofErr w:type="gramEnd"/>
+            <w:r>
+              <w:rPr>
+                <w:sz w:val="22"/>
+                <w:szCs w:val="22"/>
+              </w:rPr>
+              <w:t xml:space="preserve"> a contract with the college. </w:t>
             </w:r>
           </w:p>
           <w:p>
@@ -10656,7 +10532,6 @@
                 <w:szCs w:val="28"/>
                 <w:u w:val="single"/>
               </w:rPr>
-              <w:lastRenderedPageBreak/>
               <w:t>Full refunds minus service fee</w:t>
             </w:r>
           </w:p>
@@ -15152,7 +15027,31 @@
           <w:lang w:val="en-US"/>
           <w14:ligatures w14:val="none"/>
         </w:rPr>
-        <w:t>submit up-to-date immunization status within 45 days of commencement of study and that I must, while enrolled in the program, maintain this status in order to complete the practicum placement and graduate.</w:t>
+        <w:t xml:space="preserve">submit up-to-date immunization status within 45 days of commencement of study and that I must, while enrolled in the program, maintain this status </w:t>
+      </w:r>
+      <w:proofErr w:type="gramStart"/>
+      <w:r>
+        <w:rPr>
+          <w:rFonts w:ascii="Calibri" w:eastAsia="Calibri" w:hAnsi="Calibri" w:cs="Calibri"/>
+          <w:kern w:val="0"/>
+          <w:sz w:val="23"/>
+          <w:szCs w:val="23"/>
+          <w:lang w:val="en-US"/>
+          <w14:ligatures w14:val="none"/>
+        </w:rPr>
+        <w:t>in order to</w:t>
+      </w:r>
+      <w:proofErr w:type="gramEnd"/>
+      <w:r>
+        <w:rPr>
+          <w:rFonts w:ascii="Calibri" w:eastAsia="Calibri" w:hAnsi="Calibri" w:cs="Calibri"/>
+          <w:kern w:val="0"/>
+          <w:sz w:val="23"/>
+          <w:szCs w:val="23"/>
+          <w:lang w:val="en-US"/>
+          <w14:ligatures w14:val="none"/>
+        </w:rPr>
+        <w:t xml:space="preserve"> complete the practicum placement and graduate.</w:t>
       </w:r>
     </w:p>
     <w:p>
@@ -21801,7 +21700,25 @@
           <w:sz w:val="22"/>
           <w:szCs w:val="22"/>
         </w:rPr>
-        <w:t>We ask that you read the following carefully and sign below to acknowledge your understanding and agreement.</w:t>
+        <w:t xml:space="preserve">We ask that you read the following carefully and sign below to acknowledge </w:t>
+      </w:r>
+      <w:proofErr w:type="gramStart"/>
+      <w:r>
+        <w:rPr>
+          <w:rFonts w:asciiTheme="minorHAnsi" w:hAnsiTheme="minorHAnsi"/>
+          <w:sz w:val="22"/>
+          <w:szCs w:val="22"/>
+        </w:rPr>
+        <w:t>your</w:t>
+      </w:r>
+      <w:proofErr w:type="gramEnd"/>
+      <w:r>
+        <w:rPr>
+          <w:rFonts w:asciiTheme="minorHAnsi" w:hAnsiTheme="minorHAnsi"/>
+          <w:sz w:val="22"/>
+          <w:szCs w:val="22"/>
+        </w:rPr>
+        <w:t xml:space="preserve"> understanding and agreement.</w:t>
       </w:r>
     </w:p>
     <w:p>
@@ -21983,7 +21900,25 @@
           <w:sz w:val="22"/>
           <w:szCs w:val="22"/>
         </w:rPr>
-        <w:t xml:space="preserve"> manner at all times.</w:t>
+        <w:t xml:space="preserve"> manner </w:t>
+      </w:r>
+      <w:proofErr w:type="gramStart"/>
+      <w:r>
+        <w:rPr>
+          <w:rFonts w:asciiTheme="minorHAnsi" w:hAnsiTheme="minorHAnsi"/>
+          <w:sz w:val="22"/>
+          <w:szCs w:val="22"/>
+        </w:rPr>
+        <w:t>at all times</w:t>
+      </w:r>
+      <w:proofErr w:type="gramEnd"/>
+      <w:r>
+        <w:rPr>
+          <w:rFonts w:asciiTheme="minorHAnsi" w:hAnsiTheme="minorHAnsi"/>
+          <w:sz w:val="22"/>
+          <w:szCs w:val="22"/>
+        </w:rPr>
+        <w:t>.</w:t>
       </w:r>
     </w:p>
     <w:p>
@@ -22790,7 +22725,25 @@
           <w:sz w:val="22"/>
           <w:szCs w:val="22"/>
         </w:rPr>
-        <w:t>, with proper sign-offs.</w:t>
+        <w:t xml:space="preserve">, with proper </w:t>
+      </w:r>
+      <w:proofErr w:type="gramStart"/>
+      <w:r>
+        <w:rPr>
+          <w:rFonts w:asciiTheme="minorHAnsi" w:hAnsiTheme="minorHAnsi"/>
+          <w:sz w:val="22"/>
+          <w:szCs w:val="22"/>
+        </w:rPr>
+        <w:t>sign-offs</w:t>
+      </w:r>
+      <w:proofErr w:type="gramEnd"/>
+      <w:r>
+        <w:rPr>
+          <w:rFonts w:asciiTheme="minorHAnsi" w:hAnsiTheme="minorHAnsi"/>
+          <w:sz w:val="22"/>
+          <w:szCs w:val="22"/>
+        </w:rPr>
+        <w:t>.</w:t>
       </w:r>
     </w:p>
     <w:p>
@@ -23255,7 +23208,7 @@
           <w:sz w:val="22"/>
           <w:szCs w:val="22"/>
         </w:rPr>
-        <w:t>Date:</w:t>
+        <w:t>Date: 26/05/2026</w:t>
       </w:r>
       <w:r>
         <w:rPr>
@@ -23828,7 +23781,23 @@
           <w:szCs w:val="22"/>
         </w:rPr>
         <w:br/>
-        <w:t>I understand that it is my responsibility to ensure compliance with Immigration, Refugees and Citizenship Canada (IRCC) regulations at all times, and to seek legal or immigration counsel if needed.</w:t>
+        <w:t xml:space="preserve">I understand that it is my responsibility to ensure compliance with Immigration, Refugees and Citizenship Canada (IRCC) regulations </w:t>
+      </w:r>
+      <w:proofErr w:type="gramStart"/>
+      <w:r>
+        <w:rPr>
+          <w:sz w:val="22"/>
+          <w:szCs w:val="22"/>
+        </w:rPr>
+        <w:t>at all times</w:t>
+      </w:r>
+      <w:proofErr w:type="gramEnd"/>
+      <w:r>
+        <w:rPr>
+          <w:sz w:val="22"/>
+          <w:szCs w:val="22"/>
+        </w:rPr>
+        <w:t>, and to seek legal or immigration counsel if needed.</w:t>
       </w:r>
     </w:p>
     <w:p>
@@ -23963,7 +23932,7 @@
           <w:sz w:val="22"/>
           <w:szCs w:val="22"/>
         </w:rPr>
-        <w:t xml:space="preserve">Date: </w:t>
+        <w:t xml:space="preserve">Date: 26/05/2026 </w:t>
       </w:r>
     </w:p>
     <w:p>
@@ -24337,8 +24306,8 @@
       </w:pPr>
     </w:p>
     <w:sectPr>
-      <w:headerReference w:type="default" r:id="rId11"/>
-      <w:footerReference w:type="default" r:id="rId12"/>
+      <w:headerReference w:type="default" r:id="rId9"/>
+      <w:footerReference w:type="default" r:id="rId10"/>
       <w:pgSz w:w="12240" w:h="15840"/>
       <w:pgMar w:top="720" w:right="720" w:bottom="432" w:left="720" w:header="720" w:footer="144" w:gutter="0"/>
       <w:cols w:space="720"/>
@@ -24549,7 +24518,33 @@
         <w:sz w:val="16"/>
         <w:szCs w:val="16"/>
       </w:rPr>
-      <w:t>25 Watline Ave, Unit 204, Mississauga</w:t>
+      <w:t xml:space="preserve">25 </w:t>
+    </w:r>
+    <w:proofErr w:type="spellStart"/>
+    <w:r>
+      <w:rPr>
+        <w:rFonts w:ascii="Arial" w:hAnsi="Arial" w:cs="Arial"/>
+        <w:b/>
+        <w:bCs/>
+        <w:i/>
+        <w:iCs/>
+        <w:sz w:val="16"/>
+        <w:szCs w:val="16"/>
+      </w:rPr>
+      <w:t>Watline</w:t>
+    </w:r>
+    <w:proofErr w:type="spellEnd"/>
+    <w:r>
+      <w:rPr>
+        <w:rFonts w:ascii="Arial" w:hAnsi="Arial" w:cs="Arial"/>
+        <w:b/>
+        <w:bCs/>
+        <w:i/>
+        <w:iCs/>
+        <w:sz w:val="16"/>
+        <w:szCs w:val="16"/>
+      </w:rPr>
+      <w:t xml:space="preserve"> Ave, Unit 204, Mississauga</w:t>
     </w:r>
     <w:r>
       <w:rPr>
@@ -27475,7 +27470,6 @@
   <w:style w:type="character" w:default="1" w:styleId="DefaultParagraphFont">
     <w:name w:val="Default Paragraph Font"/>
     <w:uiPriority w:val="1"/>
-    <w:semiHidden/>
     <w:unhideWhenUsed/>
   </w:style>
   <w:style w:type="table" w:default="1" w:styleId="TableNormal">

</xml_diff>

<commit_message>
Fix contract schedule and admin dates (#36)
</commit_message>
<xml_diff>
--- a/test-output-markers-2.docx
+++ b/test-output-markers-2.docx
@@ -734,6 +734,7 @@
               </w:rPr>
               <w:t>416-555-0100</w:t>
             </w:r>
+            <w:proofErr w:type="gramStart"/>
             <w:r>
               <w:rPr>
                 <w:b/>
@@ -741,6 +742,15 @@
                 <w:sz w:val="22"/>
                 <w:szCs w:val="22"/>
               </w:rPr>
+              <w:t/>
+            </w:r>
+            <w:r>
+              <w:rPr>
+                <w:b/>
+                <w:bCs/>
+                <w:sz w:val="22"/>
+                <w:szCs w:val="22"/>
+              </w:rPr>
               <w:t xml:space="preserve">  </w:t>
             </w:r>
             <w:r>
@@ -750,6 +760,7 @@
               </w:rPr>
               <w:tab/>
             </w:r>
+            <w:proofErr w:type="gramEnd"/>
             <w:r>
               <w:rPr>
                 <w:sz w:val="22"/>
@@ -1243,282 +1254,62 @@
                 <w:szCs w:val="22"/>
               </w:rPr>
             </w:pPr>
-            <w:r>
-              <w:rPr>
-                <w:noProof/>
-                <w:sz w:val="22"/>
-                <w:szCs w:val="22"/>
-              </w:rPr>
-              <mc:AlternateContent>
-                <mc:Choice Requires="wps">
-                  <w:drawing>
-                    <wp:anchor distT="45720" distB="45720" distL="114300" distR="114300" simplePos="0" relativeHeight="251694080" behindDoc="0" locked="0" layoutInCell="1" allowOverlap="1" wp14:anchorId="467DE0D4" wp14:editId="425656E5">
-                      <wp:simplePos x="0" y="0"/>
-                      <wp:positionH relativeFrom="column">
-                        <wp:posOffset>1927390</wp:posOffset>
-                      </wp:positionH>
-                      <wp:positionV relativeFrom="paragraph">
-                        <wp:posOffset>106846</wp:posOffset>
-                      </wp:positionV>
-                      <wp:extent cx="218440" cy="231775"/>
-                      <wp:effectExtent l="0" t="0" r="10160" b="15875"/>
-                      <wp:wrapSquare wrapText="bothSides"/>
-                      <wp:docPr id="1771812289" name="Text Box 2"/>
-                      <wp:cNvGraphicFramePr>
-                        <a:graphicFrameLocks xmlns:a="http://schemas.openxmlformats.org/drawingml/2006/main"/>
-                      </wp:cNvGraphicFramePr>
-                      <a:graphic xmlns:a="http://schemas.openxmlformats.org/drawingml/2006/main">
-                        <a:graphicData uri="http://schemas.microsoft.com/office/word/2010/wordprocessingShape">
-                          <wps:wsp>
-                            <wps:cNvSpPr txBox="1">
-                              <a:spLocks noChangeArrowheads="1"/>
-                            </wps:cNvSpPr>
-                            <wps:spPr bwMode="auto">
-                              <a:xfrm>
-                                <a:off x="0" y="0"/>
-                                <a:ext cx="218440" cy="231775"/>
-                              </a:xfrm>
-                              <a:prstGeom prst="rect">
-                                <a:avLst/>
-                              </a:prstGeom>
-                              <a:solidFill>
-                                <a:srgbClr val="FFFFFF"/>
-                              </a:solidFill>
-                              <a:ln w="9525">
-                                <a:solidFill>
-                                  <a:srgbClr val="000000"/>
-                                </a:solidFill>
-                                <a:miter lim="800000"/>
-                                <a:headEnd/>
-                                <a:tailEnd/>
-                              </a:ln>
-                            </wps:spPr>
-                            <wps:txbx>
-                              <w:txbxContent>
-                                <w:p>
-                                  <w:pPr>
-                                    <w:rPr>
-                                      <w:b/>
-                                      <w:bCs/>
-                                      <w:sz w:val="20"/>
-                                      <w:szCs w:val="20"/>
-                                    </w:rPr>
-                                  </w:pPr>
-                                </w:p>
-                              </w:txbxContent>
-                            </wps:txbx>
-                            <wps:bodyPr rot="0" vert="horz" wrap="square" lIns="91440" tIns="45720" rIns="91440" bIns="45720" anchor="t" anchorCtr="0">
-                              <a:noAutofit/>
-                            </wps:bodyPr>
-                          </wps:wsp>
-                        </a:graphicData>
-                      </a:graphic>
-                      <wp14:sizeRelH relativeFrom="margin">
-                        <wp14:pctWidth>0</wp14:pctWidth>
-                      </wp14:sizeRelH>
-                      <wp14:sizeRelV relativeFrom="margin">
-                        <wp14:pctHeight>0</wp14:pctHeight>
-                      </wp14:sizeRelV>
-                    </wp:anchor>
-                  </w:drawing>
-                </mc:Choice>
-                <mc:Fallback>
-                  <w:pict>
-                    <v:shapetype w14:anchorId="467DE0D4" id="_x0000_t202" coordsize="21600,21600" o:spt="202" path="m,l,21600r21600,l21600,xe">
-                      <v:stroke joinstyle="miter"/>
-                      <v:path gradientshapeok="t" o:connecttype="rect"/>
-                    </v:shapetype>
-                    <v:shape id="Text Box 2" o:spid="_x0000_s1026" type="#_x0000_t202" style="position:absolute;margin-left:151.75pt;margin-top:8.4pt;width:17.2pt;height:18.25pt;z-index:251694080;visibility:visible;mso-wrap-style:square;mso-width-percent:0;mso-height-percent:0;mso-wrap-distance-left:9pt;mso-wrap-distance-top:3.6pt;mso-wrap-distance-right:9pt;mso-wrap-distance-bottom:3.6pt;mso-position-horizontal:absolute;mso-position-horizontal-relative:text;mso-position-vertical:absolute;mso-position-vertical-relative:text;mso-width-percent:0;mso-height-percent:0;mso-width-relative:margin;mso-height-relative:margin;v-text-anchor:top" o:gfxdata="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">
-                      <v:textbox>
-                        <w:txbxContent>
-                          <w:p>
-                            <w:pPr>
-                              <w:rPr>
-                                <w:b/>
-                                <w:bCs/>
-                                <w:sz w:val="20"/>
-                                <w:szCs w:val="20"/>
-                              </w:rPr>
-                            </w:pPr>
-                          </w:p>
-                        </w:txbxContent>
-                      </v:textbox>
-                      <w10:wrap type="square"/>
-                    </v:shape>
-                  </w:pict>
-                </mc:Fallback>
-              </mc:AlternateContent>
-            </w:r>
-            <w:r>
-              <w:rPr>
-                <w:noProof/>
-                <w:sz w:val="22"/>
-                <w:szCs w:val="22"/>
-              </w:rPr>
-              <mc:AlternateContent>
-                <mc:Choice Requires="wps">
-                  <w:drawing>
-                    <wp:anchor distT="45720" distB="45720" distL="114300" distR="114300" simplePos="0" relativeHeight="251665408" behindDoc="0" locked="0" layoutInCell="1" allowOverlap="1" wp14:anchorId="1737E518" wp14:editId="592AD27E">
-                      <wp:simplePos x="0" y="0"/>
-                      <wp:positionH relativeFrom="column">
-                        <wp:posOffset>3350205</wp:posOffset>
-                      </wp:positionH>
-                      <wp:positionV relativeFrom="paragraph">
-                        <wp:posOffset>122141</wp:posOffset>
-                      </wp:positionV>
-                      <wp:extent cx="218440" cy="231775"/>
-                      <wp:effectExtent l="0" t="0" r="10160" b="15875"/>
-                      <wp:wrapSquare wrapText="bothSides"/>
-                      <wp:docPr id="1126634135" name="Text Box 2"/>
-                      <wp:cNvGraphicFramePr>
-                        <a:graphicFrameLocks xmlns:a="http://schemas.openxmlformats.org/drawingml/2006/main"/>
-                      </wp:cNvGraphicFramePr>
-                      <a:graphic xmlns:a="http://schemas.openxmlformats.org/drawingml/2006/main">
-                        <a:graphicData uri="http://schemas.microsoft.com/office/word/2010/wordprocessingShape">
-                          <wps:wsp>
-                            <wps:cNvSpPr txBox="1">
-                              <a:spLocks noChangeArrowheads="1"/>
-                            </wps:cNvSpPr>
-                            <wps:spPr bwMode="auto">
-                              <a:xfrm>
-                                <a:off x="0" y="0"/>
-                                <a:ext cx="218440" cy="231775"/>
-                              </a:xfrm>
-                              <a:prstGeom prst="rect">
-                                <a:avLst/>
-                              </a:prstGeom>
-                              <a:solidFill>
-                                <a:srgbClr val="FFFFFF"/>
-                              </a:solidFill>
-                              <a:ln w="9525">
-                                <a:solidFill>
-                                  <a:srgbClr val="000000"/>
-                                </a:solidFill>
-                                <a:miter lim="800000"/>
-                                <a:headEnd/>
-                                <a:tailEnd/>
-                              </a:ln>
-                            </wps:spPr>
-                            <wps:txbx>
-                              <w:txbxContent>
-                                <w:p>
-                                  <w:pPr>
-                                    <w:rPr>
-                                      <w:b/>
-                                      <w:bCs/>
-                                      <w:sz w:val="20"/>
-                                      <w:szCs w:val="20"/>
-                                    </w:rPr>
-                                  </w:pPr>
-                                  <w:r>
-                                    <w:rPr>
-                                      <w:b/>
-                                      <w:bCs/>
-                                      <w:sz w:val="20"/>
-                                      <w:szCs w:val="20"/>
-                                    </w:rPr>
-                                    <w:t>X</w:t>
-                                  </w:r>
-                                </w:p>
-                              </w:txbxContent>
-                            </wps:txbx>
-                            <wps:bodyPr rot="0" vert="horz" wrap="square" lIns="91440" tIns="45720" rIns="91440" bIns="45720" anchor="t" anchorCtr="0">
-                              <a:noAutofit/>
-                            </wps:bodyPr>
-                          </wps:wsp>
-                        </a:graphicData>
-                      </a:graphic>
-                      <wp14:sizeRelH relativeFrom="margin">
-                        <wp14:pctWidth>0</wp14:pctWidth>
-                      </wp14:sizeRelH>
-                      <wp14:sizeRelV relativeFrom="margin">
-                        <wp14:pctHeight>0</wp14:pctHeight>
-                      </wp14:sizeRelV>
-                    </wp:anchor>
-                  </w:drawing>
-                </mc:Choice>
-                <mc:Fallback>
-                  <w:pict>
-                    <v:shape w14:anchorId="1737E518" id="_x0000_s1027" type="#_x0000_t202" style="position:absolute;margin-left:263.8pt;margin-top:9.6pt;width:17.2pt;height:18.25pt;z-index:251665408;visibility:visible;mso-wrap-style:square;mso-width-percent:0;mso-height-percent:0;mso-wrap-distance-left:9pt;mso-wrap-distance-top:3.6pt;mso-wrap-distance-right:9pt;mso-wrap-distance-bottom:3.6pt;mso-position-horizontal:absolute;mso-position-horizontal-relative:text;mso-position-vertical:absolute;mso-position-vertical-relative:text;mso-width-percent:0;mso-height-percent:0;mso-width-relative:margin;mso-height-relative:margin;v-text-anchor:top" o:gfxdata="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">
-                      <v:textbox>
-                        <w:txbxContent>
-                          <w:p>
-                            <w:pPr>
-                              <w:rPr>
-                                <w:b/>
-                                <w:bCs/>
-                                <w:sz w:val="20"/>
-                                <w:szCs w:val="20"/>
-                              </w:rPr>
-                            </w:pPr>
-                            <w:r>
-                              <w:rPr>
-                                <w:b/>
-                                <w:bCs/>
-                                <w:sz w:val="20"/>
-                                <w:szCs w:val="20"/>
-                              </w:rPr>
-                              <w:t>X</w:t>
-                            </w:r>
-                          </w:p>
-                        </w:txbxContent>
-                      </v:textbox>
-                      <w10:wrap type="square"/>
-                    </v:shape>
-                  </w:pict>
-                </mc:Fallback>
-              </mc:AlternateContent>
-            </w:r>
-          </w:p>
-          <w:p>
-            <w:pPr>
-              <w:pStyle w:val="Default"/>
-              <w:rPr>
-                <w:sz w:val="22"/>
-                <w:szCs w:val="22"/>
-              </w:rPr>
-            </w:pPr>
-            <w:r>
-              <w:rPr>
-                <w:sz w:val="22"/>
-                <w:szCs w:val="22"/>
-              </w:rPr>
-              <w:t xml:space="preserve">International Student:  </w:t>
-            </w:r>
-            <w:r>
-              <w:rPr>
-                <w:sz w:val="22"/>
-                <w:szCs w:val="22"/>
-              </w:rPr>
-              <w:t xml:space="preserve">☐ Yes</w:t>
-            </w:r>
-            <w:r>
-              <w:rPr>
-                <w:sz w:val="22"/>
-                <w:szCs w:val="22"/>
-              </w:rPr>
-              <w:tab/>
-            </w:r>
-            <w:r>
-              <w:rPr>
-                <w:sz w:val="22"/>
-                <w:szCs w:val="22"/>
-              </w:rPr>
-              <w:tab/>
-            </w:r>
-            <w:r>
-              <w:rPr>
-                <w:sz w:val="22"/>
-                <w:szCs w:val="22"/>
-              </w:rPr>
-              <w:tab/>
-            </w:r>
-            <w:r>
-              <w:rPr>
-                <w:sz w:val="22"/>
-                <w:szCs w:val="22"/>
-              </w:rPr>
-              <w:t xml:space="preserve">☒ No</w:t>
+          </w:p>
+          <w:p>
+            <w:pPr>
+              <w:pStyle w:val="Default"/>
+              <w:rPr>
+                <w:sz w:val="22"/>
+                <w:szCs w:val="22"/>
+              </w:rPr>
+            </w:pPr>
+            <w:r>
+              <w:rPr>
+                <w:sz w:val="22"/>
+                <w:szCs w:val="22"/>
+              </w:rPr>
+              <w:t xml:space="preserve">International Student: [ ]</w:t>
+            </w:r>
+            <w:proofErr w:type="spellStart"/>
+            <w:r>
+              <w:rPr>
+                <w:sz w:val="22"/>
+                <w:szCs w:val="22"/>
+              </w:rPr>
+              <w:t/>
+            </w:r>
+            <w:proofErr w:type="spellEnd"/>
+            <w:r>
+              <w:rPr>
+                <w:sz w:val="22"/>
+                <w:szCs w:val="22"/>
+              </w:rPr>
+              <w:t xml:space="preserve"> Yes     </w:t>
+            </w:r>
+            <w:proofErr w:type="gramStart"/>
+            <w:r>
+              <w:rPr>
+                <w:sz w:val="22"/>
+                <w:szCs w:val="22"/>
+              </w:rPr>
+              <w:t xml:space="preserve">   [X]</w:t>
+            </w:r>
+            <w:proofErr w:type="spellStart"/>
+            <w:proofErr w:type="gramEnd"/>
+            <w:r>
+              <w:rPr>
+                <w:sz w:val="22"/>
+                <w:szCs w:val="22"/>
+              </w:rPr>
+              <w:t/>
+            </w:r>
+            <w:proofErr w:type="spellEnd"/>
+            <w:r>
+              <w:rPr>
+                <w:sz w:val="22"/>
+                <w:szCs w:val="22"/>
+              </w:rPr>
+              <w:t xml:space="preserve"> No</w:t>
             </w:r>
           </w:p>
           <w:p>
@@ -2308,7 +2099,27 @@
                 <w:sz w:val="28"/>
                 <w:szCs w:val="28"/>
               </w:rPr>
-              <w:t xml:space="preserve">25 Watline Avenue, Unit 204 </w:t>
+              <w:t xml:space="preserve">25 Watline Avenue, Unit 204</w:t>
+            </w:r>
+            <w:proofErr w:type="spellStart"/>
+            <w:r>
+              <w:rPr>
+                <w:b/>
+                <w:bCs/>
+                <w:sz w:val="28"/>
+                <w:szCs w:val="28"/>
+              </w:rPr>
+              <w:t/>
+            </w:r>
+            <w:proofErr w:type="spellEnd"/>
+            <w:r>
+              <w:rPr>
+                <w:b/>
+                <w:bCs/>
+                <w:sz w:val="28"/>
+                <w:szCs w:val="28"/>
+              </w:rPr>
+              <w:t xml:space="preserve"> </w:t>
             </w:r>
           </w:p>
           <w:p>
@@ -3024,7 +2835,7 @@
                       <w:sz w:val="22"/>
                       <w:szCs w:val="22"/>
                     </w:rPr>
-                    <w:t>8:00AM-2:00PM</w:t>
+                    <w:t>8:00 AM to 2:00 PM</w:t>
                   </w:r>
                 </w:p>
               </w:tc>
@@ -3047,7 +2858,7 @@
                       <w:sz w:val="22"/>
                       <w:szCs w:val="22"/>
                     </w:rPr>
-                    <w:t>8:00AM-2:00PM</w:t>
+                    <w:t>8:00 AM to 2:00 PM</w:t>
                   </w:r>
                 </w:p>
               </w:tc>
@@ -3070,7 +2881,7 @@
                       <w:sz w:val="22"/>
                       <w:szCs w:val="22"/>
                     </w:rPr>
-                    <w:t>8:00AM-2:00PM</w:t>
+                    <w:t>8:00 AM to 2:00 PM</w:t>
                   </w:r>
                 </w:p>
               </w:tc>
@@ -3093,7 +2904,7 @@
                       <w:sz w:val="22"/>
                       <w:szCs w:val="22"/>
                     </w:rPr>
-                    <w:t>8:00AM-2:00PM</w:t>
+                    <w:t>8:00 AM to 2:00 PM</w:t>
                   </w:r>
                 </w:p>
               </w:tc>
@@ -3118,7 +2929,7 @@
                       <w:sz w:val="22"/>
                       <w:szCs w:val="22"/>
                     </w:rPr>
-                    <w:t>8:00AM-2:00PM</w:t>
+                    <w:t>8:00 AM to 2:00 PM</w:t>
                   </w:r>
                 </w:p>
               </w:tc>
@@ -3886,174 +3697,76 @@
             </w:pPr>
             <w:r>
               <w:rPr>
-                <w:noProof/>
-                <w:sz w:val="22"/>
-                <w:szCs w:val="22"/>
-              </w:rPr>
-              <mc:AlternateContent>
-                <mc:Choice Requires="wps">
-                  <w:drawing>
-                    <wp:anchor distT="45720" distB="45720" distL="114300" distR="114300" simplePos="0" relativeHeight="251669504" behindDoc="0" locked="0" layoutInCell="1" allowOverlap="1" wp14:anchorId="3C7F2D48" wp14:editId="3DDD7C8B">
-                      <wp:simplePos x="0" y="0"/>
-                      <wp:positionH relativeFrom="column">
-                        <wp:posOffset>2817826</wp:posOffset>
-                      </wp:positionH>
-                      <wp:positionV relativeFrom="paragraph">
-                        <wp:posOffset>122389</wp:posOffset>
-                      </wp:positionV>
-                      <wp:extent cx="218440" cy="231775"/>
-                      <wp:effectExtent l="0" t="0" r="10160" b="15875"/>
-                      <wp:wrapSquare wrapText="bothSides"/>
-                      <wp:docPr id="751020824" name="Text Box 2"/>
-                      <wp:cNvGraphicFramePr>
-                        <a:graphicFrameLocks xmlns:a="http://schemas.openxmlformats.org/drawingml/2006/main"/>
-                      </wp:cNvGraphicFramePr>
-                      <a:graphic xmlns:a="http://schemas.openxmlformats.org/drawingml/2006/main">
-                        <a:graphicData uri="http://schemas.microsoft.com/office/word/2010/wordprocessingShape">
-                          <wps:wsp>
-                            <wps:cNvSpPr txBox="1">
-                              <a:spLocks noChangeArrowheads="1"/>
-                            </wps:cNvSpPr>
-                            <wps:spPr bwMode="auto">
-                              <a:xfrm>
-                                <a:off x="0" y="0"/>
-                                <a:ext cx="218440" cy="231775"/>
-                              </a:xfrm>
-                              <a:prstGeom prst="rect">
-                                <a:avLst/>
-                              </a:prstGeom>
-                              <a:solidFill>
-                                <a:srgbClr val="FFFFFF"/>
-                              </a:solidFill>
-                              <a:ln w="9525">
-                                <a:solidFill>
-                                  <a:srgbClr val="000000"/>
-                                </a:solidFill>
-                                <a:miter lim="800000"/>
-                                <a:headEnd/>
-                                <a:tailEnd/>
-                              </a:ln>
-                            </wps:spPr>
-                            <wps:txbx>
-                              <w:txbxContent>
-                                <w:p>
-                                  <w:pPr>
-                                    <w:rPr>
-                                      <w:b/>
-                                      <w:bCs/>
-                                      <w:sz w:val="20"/>
-                                      <w:szCs w:val="20"/>
-                                    </w:rPr>
-                                  </w:pPr>
-                                  <w:r>
-                                    <w:rPr>
-                                      <w:b/>
-                                      <w:bCs/>
-                                      <w:sz w:val="20"/>
-                                      <w:szCs w:val="20"/>
-                                    </w:rPr>
-                                    <w:t>X</w:t>
-                                  </w:r>
-                                </w:p>
-                              </w:txbxContent>
-                            </wps:txbx>
-                            <wps:bodyPr rot="0" vert="horz" wrap="square" lIns="91440" tIns="45720" rIns="91440" bIns="45720" anchor="t" anchorCtr="0">
-                              <a:noAutofit/>
-                            </wps:bodyPr>
-                          </wps:wsp>
-                        </a:graphicData>
-                      </a:graphic>
-                      <wp14:sizeRelH relativeFrom="margin">
-                        <wp14:pctWidth>0</wp14:pctWidth>
-                      </wp14:sizeRelH>
-                      <wp14:sizeRelV relativeFrom="margin">
-                        <wp14:pctHeight>0</wp14:pctHeight>
-                      </wp14:sizeRelV>
-                    </wp:anchor>
-                  </w:drawing>
-                </mc:Choice>
-                <mc:Fallback>
-                  <w:pict>
-                    <v:shape w14:anchorId="3C7F2D48" id="_x0000_s1030" type="#_x0000_t202" style="position:absolute;margin-left:221.9pt;margin-top:9.65pt;width:17.2pt;height:18.25pt;z-index:251669504;visibility:visible;mso-wrap-style:square;mso-width-percent:0;mso-height-percent:0;mso-wrap-distance-left:9pt;mso-wrap-distance-top:3.6pt;mso-wrap-distance-right:9pt;mso-wrap-distance-bottom:3.6pt;mso-position-horizontal:absolute;mso-position-horizontal-relative:text;mso-position-vertical:absolute;mso-position-vertical-relative:text;mso-width-percent:0;mso-height-percent:0;mso-width-relative:margin;mso-height-relative:margin;v-text-anchor:top" o:gfxdata="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">
-                      <v:textbox>
-                        <w:txbxContent>
-                          <w:p>
-                            <w:pPr>
-                              <w:rPr>
-                                <w:b/>
-                                <w:bCs/>
-                                <w:sz w:val="20"/>
-                                <w:szCs w:val="20"/>
-                              </w:rPr>
-                            </w:pPr>
-                            <w:r>
-                              <w:rPr>
-                                <w:b/>
-                                <w:bCs/>
-                                <w:sz w:val="20"/>
-                                <w:szCs w:val="20"/>
-                              </w:rPr>
-                              <w:t>X</w:t>
-                            </w:r>
-                          </w:p>
-                        </w:txbxContent>
-                      </v:textbox>
-                      <w10:wrap type="square"/>
-                    </v:shape>
-                  </w:pict>
-                </mc:Fallback>
-              </mc:AlternateContent>
-            </w:r>
-          </w:p>
-          <w:p>
-            <w:pPr>
-              <w:pStyle w:val="Default"/>
-              <w:rPr>
-                <w:sz w:val="22"/>
-                <w:szCs w:val="22"/>
-              </w:rPr>
-            </w:pPr>
-            <w:r>
-              <w:rPr>
-                <w:sz w:val="22"/>
-                <w:szCs w:val="22"/>
-              </w:rPr>
-              <w:t xml:space="preserve">Method of program delivery  </w:t>
-            </w:r>
-            <w:r>
-              <w:rPr>
-                <w:sz w:val="22"/>
-                <w:szCs w:val="22"/>
-              </w:rPr>
-              <w:t xml:space="preserve">☐ in-person</w:t>
-            </w:r>
-            <w:r>
-              <w:rPr>
-                <w:sz w:val="22"/>
-                <w:szCs w:val="22"/>
-              </w:rPr>
-              <w:t xml:space="preserve">    </w:t>
-            </w:r>
-            <w:r>
-              <w:rPr>
-                <w:sz w:val="22"/>
-                <w:szCs w:val="22"/>
-              </w:rPr>
-              <w:t xml:space="preserve">☐ Hybrid</w:t>
-            </w:r>
-            <w:r>
-              <w:rPr>
-                <w:sz w:val="22"/>
-                <w:szCs w:val="22"/>
-              </w:rPr>
-              <w:t xml:space="preserve">      </w:t>
-            </w:r>
-            <w:r>
-              <w:rPr>
-                <w:sz w:val="22"/>
-                <w:szCs w:val="22"/>
-              </w:rPr>
-              <w:t xml:space="preserve">☒ Online</w:t>
+                <w:sz w:val="22"/>
+                <w:szCs w:val="22"/>
+              </w:rPr>
+              <w:t>Method of program delivery</w:t>
+            </w:r>
+            <w:proofErr w:type="gramStart"/>
+            <w:r>
+              <w:rPr>
+                <w:sz w:val="22"/>
+                <w:szCs w:val="22"/>
+              </w:rPr>
+              <w:t xml:space="preserve">   [ ]</w:t>
+            </w:r>
+            <w:proofErr w:type="spellStart"/>
+            <w:proofErr w:type="gramEnd"/>
+            <w:r>
+              <w:rPr>
+                <w:sz w:val="22"/>
+                <w:szCs w:val="22"/>
+              </w:rPr>
+              <w:t/>
+            </w:r>
+            <w:proofErr w:type="spellEnd"/>
+            <w:r>
+              <w:rPr>
+                <w:sz w:val="22"/>
+                <w:szCs w:val="22"/>
+              </w:rPr>
+              <w:t xml:space="preserve"> in-</w:t>
+            </w:r>
+            <w:proofErr w:type="gramStart"/>
+            <w:r>
+              <w:rPr>
+                <w:sz w:val="22"/>
+                <w:szCs w:val="22"/>
+              </w:rPr>
+              <w:t xml:space="preserve">person  [ ]</w:t>
+            </w:r>
+            <w:proofErr w:type="spellStart"/>
+            <w:proofErr w:type="gramEnd"/>
+            <w:r>
+              <w:rPr>
+                <w:sz w:val="22"/>
+                <w:szCs w:val="22"/>
+              </w:rPr>
+              <w:t/>
+            </w:r>
+            <w:proofErr w:type="spellEnd"/>
+            <w:r>
+              <w:rPr>
+                <w:sz w:val="22"/>
+                <w:szCs w:val="22"/>
+              </w:rPr>
+              <w:t xml:space="preserve"> Hybrid [X]</w:t>
+            </w:r>
+            <w:proofErr w:type="spellStart"/>
+            <w:r>
+              <w:rPr>
+                <w:sz w:val="22"/>
+                <w:szCs w:val="22"/>
+              </w:rPr>
+              <w:t/>
+            </w:r>
+            <w:proofErr w:type="spellEnd"/>
+            <w:r>
+              <w:rPr>
+                <w:sz w:val="22"/>
+                <w:szCs w:val="22"/>
+              </w:rPr>
+              <w:t xml:space="preserve"> Online</w:t>
             </w:r>
           </w:p>
           <w:p>
@@ -4167,7 +3880,7 @@
               </w:rPr>
               <w:t xml:space="preserve">International Student and/or Applicant with foreign credentials. All foreign credentials must be translated into English and compared for Grade 12 equivalency by a recognized organization such as World Education Services: </w:t>
             </w:r>
-            <w:hyperlink r:id="rId10" w:history="1">
+            <w:hyperlink r:id="rId8" w:history="1">
               <w:r>
                 <w:rPr>
                   <w:rStyle w:val="Hyperlink"/>
@@ -4240,15 +3953,18 @@
           <w:p>
             <w:pPr>
               <w:pStyle w:val="Default"/>
+              <w:ind w:left="720"/>
               <w:rPr>
                 <w:b/>
                 <w:bCs/>
                 <w:sz w:val="22"/>
                 <w:szCs w:val="22"/>
-                <w:u w:val="single"/>
-              </w:rPr>
-            </w:pPr>
-            <w:r>
+              </w:rPr>
+            </w:pPr>
+          </w:p>
+          <w:p>
+            <w:pPr>
+              <w:pStyle w:val="Default"/>
               <w:rPr>
                 <w:b/>
                 <w:bCs/>
@@ -4256,7 +3972,27 @@
                 <w:szCs w:val="22"/>
                 <w:u w:val="single"/>
               </w:rPr>
-              <w:br w:type="page"/>
+            </w:pPr>
+          </w:p>
+          <w:p>
+            <w:pPr>
+              <w:pStyle w:val="Default"/>
+              <w:rPr>
+                <w:b/>
+                <w:bCs/>
+                <w:sz w:val="22"/>
+                <w:szCs w:val="22"/>
+                <w:u w:val="single"/>
+              </w:rPr>
+            </w:pPr>
+            <w:r>
+              <w:rPr>
+                <w:b/>
+                <w:bCs/>
+                <w:sz w:val="22"/>
+                <w:szCs w:val="22"/>
+                <w:u w:val="single"/>
+              </w:rPr>
               <w:t>English Language Proficiency</w:t>
             </w:r>
           </w:p>
@@ -4586,6 +4322,7 @@
               </w:rPr>
               <w:t xml:space="preserve">            </w:t>
             </w:r>
+            <w:proofErr w:type="gramStart"/>
             <w:r>
               <w:rPr>
                 <w:sz w:val="22"/>
@@ -4613,6 +4350,14 @@
                 <w:szCs w:val="22"/>
               </w:rPr>
               <w:t>___5,365______________</w:t>
+            </w:r>
+            <w:proofErr w:type="gramEnd"/>
+            <w:r>
+              <w:rPr>
+                <w:sz w:val="22"/>
+                <w:szCs w:val="22"/>
+              </w:rPr>
+              <w:t/>
             </w:r>
             <w:r>
               <w:rPr>
@@ -5448,7 +5193,6 @@
                 <w:szCs w:val="28"/>
                 <w:u w:val="single"/>
               </w:rPr>
-              <w:lastRenderedPageBreak/>
               <w:t>Payment Schedule</w:t>
             </w:r>
           </w:p>
@@ -8309,6 +8053,7 @@
               </w:rPr>
               <w:t xml:space="preserve">(Signature of </w:t>
             </w:r>
+            <w:proofErr w:type="gramStart"/>
             <w:r>
               <w:rPr>
                 <w:sz w:val="22"/>
@@ -8328,7 +8073,15 @@
                 <w:sz w:val="22"/>
                 <w:szCs w:val="22"/>
               </w:rPr>
-              <w:t xml:space="preserve">                                                                 Date</w:t>
+              <w:t xml:space="preserve"> </w:t>
+            </w:r>
+            <w:proofErr w:type="gramEnd"/>
+            <w:r>
+              <w:rPr>
+                <w:sz w:val="22"/>
+                <w:szCs w:val="22"/>
+              </w:rPr>
+              <w:t xml:space="preserve">                                                                Date</w:t>
             </w:r>
             <w:r>
               <w:rPr>
@@ -8828,6 +8581,7 @@
               </w:rPr>
               <w:t xml:space="preserve">(Signature of </w:t>
             </w:r>
+            <w:proofErr w:type="gramStart"/>
             <w:r>
               <w:rPr>
                 <w:sz w:val="22"/>
@@ -8847,7 +8601,15 @@
                 <w:sz w:val="22"/>
                 <w:szCs w:val="22"/>
               </w:rPr>
-              <w:t xml:space="preserve">                                </w:t>
+              <w:t xml:space="preserve"> </w:t>
+            </w:r>
+            <w:proofErr w:type="gramEnd"/>
+            <w:r>
+              <w:rPr>
+                <w:sz w:val="22"/>
+                <w:szCs w:val="22"/>
+              </w:rPr>
+              <w:t xml:space="preserve">                               </w:t>
             </w:r>
             <w:r>
               <w:rPr>
@@ -8875,7 +8637,23 @@
                 <w:sz w:val="22"/>
                 <w:szCs w:val="22"/>
               </w:rPr>
-              <w:t xml:space="preserve">           (Date)</w:t>
+              <w:t xml:space="preserve">        </w:t>
+            </w:r>
+            <w:proofErr w:type="gramStart"/>
+            <w:r>
+              <w:rPr>
+                <w:sz w:val="22"/>
+                <w:szCs w:val="22"/>
+              </w:rPr>
+              <w:t xml:space="preserve">   (</w:t>
+            </w:r>
+            <w:proofErr w:type="gramEnd"/>
+            <w:r>
+              <w:rPr>
+                <w:sz w:val="22"/>
+                <w:szCs w:val="22"/>
+              </w:rPr>
+              <w:t>Date)</w:t>
             </w:r>
           </w:p>
           <w:p>
@@ -9132,6 +8910,7 @@
               </w:rPr>
               <w:t xml:space="preserve">      (Signature of Admission Officer, Registrar, </w:t>
             </w:r>
+            <w:proofErr w:type="gramStart"/>
             <w:r>
               <w:rPr>
                 <w:sz w:val="22"/>
@@ -9151,7 +8930,15 @@
                 <w:sz w:val="22"/>
                 <w:szCs w:val="22"/>
               </w:rPr>
-              <w:t xml:space="preserve">                                  Date</w:t>
+              <w:t xml:space="preserve"> </w:t>
+            </w:r>
+            <w:proofErr w:type="gramEnd"/>
+            <w:r>
+              <w:rPr>
+                <w:sz w:val="22"/>
+                <w:szCs w:val="22"/>
+              </w:rPr>
+              <w:t xml:space="preserve">                                 Date: 26/05/2026</w:t>
             </w:r>
           </w:p>
           <w:p>
@@ -9732,7 +9519,23 @@
                 <w:sz w:val="22"/>
                 <w:szCs w:val="22"/>
               </w:rPr>
-              <w:t>I understand that I can refuse to sign this consent form and that I can withdraw my consent at any time for future uses of my personal information by writing to the Chief Operating Officer at 25 Watline Avenue, Unit 204 Mississauga, Ontario, L4Z 2Z1. I understand that if I refuse or withdraw my consent the Superintendent may not be able to contact me to inform me of my rights under the Act or collect information to help potential students make informed decisions about their educational choices.</w:t>
+              <w:t xml:space="preserve">I understand that I can refuse to sign this consent form and that I can withdraw my consent at any time for future uses of my personal information by writing to the Chief Operating Officer at 25 </w:t>
+            </w:r>
+            <w:proofErr w:type="spellStart"/>
+            <w:r>
+              <w:rPr>
+                <w:sz w:val="22"/>
+                <w:szCs w:val="22"/>
+              </w:rPr>
+              <w:t>Watline</w:t>
+            </w:r>
+            <w:proofErr w:type="spellEnd"/>
+            <w:r>
+              <w:rPr>
+                <w:sz w:val="22"/>
+                <w:szCs w:val="22"/>
+              </w:rPr>
+              <w:t xml:space="preserve"> Avenue, Unit 204 Mississauga, Ontario, L4Z 2Z1. I understand that if I refuse or withdraw my consent the Superintendent may not be able to contact me to inform me of my rights under the Act or collect information to help potential students make informed decisions about their educational choices.</w:t>
             </w:r>
           </w:p>
           <w:p>
@@ -9978,6 +9781,7 @@
               </w:rPr>
               <w:t xml:space="preserve">(Signature of </w:t>
             </w:r>
+            <w:proofErr w:type="gramStart"/>
             <w:r>
               <w:rPr>
                 <w:sz w:val="22"/>
@@ -9990,7 +9794,15 @@
                 <w:sz w:val="22"/>
                 <w:szCs w:val="22"/>
               </w:rPr>
-              <w:t xml:space="preserve">                                                  </w:t>
+              <w:t xml:space="preserve"> </w:t>
+            </w:r>
+            <w:proofErr w:type="gramEnd"/>
+            <w:r>
+              <w:rPr>
+                <w:sz w:val="22"/>
+                <w:szCs w:val="22"/>
+              </w:rPr>
+              <w:t xml:space="preserve">                                                 </w:t>
             </w:r>
             <w:r>
               <w:rPr>
@@ -10004,7 +9816,23 @@
                 <w:sz w:val="22"/>
                 <w:szCs w:val="22"/>
               </w:rPr>
-              <w:t xml:space="preserve">     (Date)</w:t>
+              <w:t xml:space="preserve">  </w:t>
+            </w:r>
+            <w:proofErr w:type="gramStart"/>
+            <w:r>
+              <w:rPr>
+                <w:sz w:val="22"/>
+                <w:szCs w:val="22"/>
+              </w:rPr>
+              <w:t xml:space="preserve">   (</w:t>
+            </w:r>
+            <w:proofErr w:type="gramEnd"/>
+            <w:r>
+              <w:rPr>
+                <w:sz w:val="22"/>
+                <w:szCs w:val="22"/>
+              </w:rPr>
+              <w:t>Date)</w:t>
             </w:r>
           </w:p>
           <w:p>
@@ -10258,7 +10086,23 @@
                 <w:sz w:val="22"/>
                 <w:szCs w:val="22"/>
               </w:rPr>
-              <w:t xml:space="preserve"> mid-point” means the point in the progress of a vocational program where half of the scheduled hours of instruction for the program have taken place; (“mi-parcours du programme”) </w:t>
+              <w:t xml:space="preserve"> mid-point” means the point in the progress of a vocational program where half of the scheduled hours of instruction for the program have taken place; (“mi-</w:t>
+            </w:r>
+            <w:proofErr w:type="spellStart"/>
+            <w:r>
+              <w:rPr>
+                <w:sz w:val="22"/>
+                <w:szCs w:val="22"/>
+              </w:rPr>
+              <w:t>parcours</w:t>
+            </w:r>
+            <w:proofErr w:type="spellEnd"/>
+            <w:r>
+              <w:rPr>
+                <w:sz w:val="22"/>
+                <w:szCs w:val="22"/>
+              </w:rPr>
+              <w:t xml:space="preserve"> du programme”) </w:t>
             </w:r>
           </w:p>
           <w:p>
@@ -10338,7 +10182,23 @@
                 <w:sz w:val="22"/>
                 <w:szCs w:val="22"/>
               </w:rPr>
-              <w:t xml:space="preserve">25. If a student has entered into a contract with a career college for a vocational program, the college shall give a refund of all fees paid for the program in the following circumstances: </w:t>
+              <w:t xml:space="preserve">25. If a student has </w:t>
+            </w:r>
+            <w:proofErr w:type="gramStart"/>
+            <w:r>
+              <w:rPr>
+                <w:sz w:val="22"/>
+                <w:szCs w:val="22"/>
+              </w:rPr>
+              <w:t>entered into</w:t>
+            </w:r>
+            <w:proofErr w:type="gramEnd"/>
+            <w:r>
+              <w:rPr>
+                <w:sz w:val="22"/>
+                <w:szCs w:val="22"/>
+              </w:rPr>
+              <w:t xml:space="preserve"> a contract with a career college for a vocational program, the college shall give a refund of all fees paid for the program in the following circumstances: </w:t>
             </w:r>
           </w:p>
           <w:p>
@@ -10463,7 +10323,23 @@
                 <w:sz w:val="22"/>
                 <w:szCs w:val="22"/>
               </w:rPr>
-              <w:t xml:space="preserve">5.The college collects any fees other than a service fee before the student has entered into a contract with the college. </w:t>
+              <w:t xml:space="preserve">5.The college collects any fees other than a service fee before the student has </w:t>
+            </w:r>
+            <w:proofErr w:type="gramStart"/>
+            <w:r>
+              <w:rPr>
+                <w:sz w:val="22"/>
+                <w:szCs w:val="22"/>
+              </w:rPr>
+              <w:t>entered into</w:t>
+            </w:r>
+            <w:proofErr w:type="gramEnd"/>
+            <w:r>
+              <w:rPr>
+                <w:sz w:val="22"/>
+                <w:szCs w:val="22"/>
+              </w:rPr>
+              <w:t xml:space="preserve"> a contract with the college. </w:t>
             </w:r>
           </w:p>
           <w:p>
@@ -10656,7 +10532,6 @@
                 <w:szCs w:val="28"/>
                 <w:u w:val="single"/>
               </w:rPr>
-              <w:lastRenderedPageBreak/>
               <w:t>Full refunds minus service fee</w:t>
             </w:r>
           </w:p>
@@ -15152,7 +15027,31 @@
           <w:lang w:val="en-US"/>
           <w14:ligatures w14:val="none"/>
         </w:rPr>
-        <w:t>submit up-to-date immunization status within 45 days of commencement of study and that I must, while enrolled in the program, maintain this status in order to complete the practicum placement and graduate.</w:t>
+        <w:t xml:space="preserve">submit up-to-date immunization status within 45 days of commencement of study and that I must, while enrolled in the program, maintain this status </w:t>
+      </w:r>
+      <w:proofErr w:type="gramStart"/>
+      <w:r>
+        <w:rPr>
+          <w:rFonts w:ascii="Calibri" w:eastAsia="Calibri" w:hAnsi="Calibri" w:cs="Calibri"/>
+          <w:kern w:val="0"/>
+          <w:sz w:val="23"/>
+          <w:szCs w:val="23"/>
+          <w:lang w:val="en-US"/>
+          <w14:ligatures w14:val="none"/>
+        </w:rPr>
+        <w:t>in order to</w:t>
+      </w:r>
+      <w:proofErr w:type="gramEnd"/>
+      <w:r>
+        <w:rPr>
+          <w:rFonts w:ascii="Calibri" w:eastAsia="Calibri" w:hAnsi="Calibri" w:cs="Calibri"/>
+          <w:kern w:val="0"/>
+          <w:sz w:val="23"/>
+          <w:szCs w:val="23"/>
+          <w:lang w:val="en-US"/>
+          <w14:ligatures w14:val="none"/>
+        </w:rPr>
+        <w:t xml:space="preserve"> complete the practicum placement and graduate.</w:t>
       </w:r>
     </w:p>
     <w:p>
@@ -21801,7 +21700,25 @@
           <w:sz w:val="22"/>
           <w:szCs w:val="22"/>
         </w:rPr>
-        <w:t>We ask that you read the following carefully and sign below to acknowledge your understanding and agreement.</w:t>
+        <w:t xml:space="preserve">We ask that you read the following carefully and sign below to acknowledge </w:t>
+      </w:r>
+      <w:proofErr w:type="gramStart"/>
+      <w:r>
+        <w:rPr>
+          <w:rFonts w:asciiTheme="minorHAnsi" w:hAnsiTheme="minorHAnsi"/>
+          <w:sz w:val="22"/>
+          <w:szCs w:val="22"/>
+        </w:rPr>
+        <w:t>your</w:t>
+      </w:r>
+      <w:proofErr w:type="gramEnd"/>
+      <w:r>
+        <w:rPr>
+          <w:rFonts w:asciiTheme="minorHAnsi" w:hAnsiTheme="minorHAnsi"/>
+          <w:sz w:val="22"/>
+          <w:szCs w:val="22"/>
+        </w:rPr>
+        <w:t xml:space="preserve"> understanding and agreement.</w:t>
       </w:r>
     </w:p>
     <w:p>
@@ -21983,7 +21900,25 @@
           <w:sz w:val="22"/>
           <w:szCs w:val="22"/>
         </w:rPr>
-        <w:t xml:space="preserve"> manner at all times.</w:t>
+        <w:t xml:space="preserve"> manner </w:t>
+      </w:r>
+      <w:proofErr w:type="gramStart"/>
+      <w:r>
+        <w:rPr>
+          <w:rFonts w:asciiTheme="minorHAnsi" w:hAnsiTheme="minorHAnsi"/>
+          <w:sz w:val="22"/>
+          <w:szCs w:val="22"/>
+        </w:rPr>
+        <w:t>at all times</w:t>
+      </w:r>
+      <w:proofErr w:type="gramEnd"/>
+      <w:r>
+        <w:rPr>
+          <w:rFonts w:asciiTheme="minorHAnsi" w:hAnsiTheme="minorHAnsi"/>
+          <w:sz w:val="22"/>
+          <w:szCs w:val="22"/>
+        </w:rPr>
+        <w:t>.</w:t>
       </w:r>
     </w:p>
     <w:p>
@@ -22790,7 +22725,25 @@
           <w:sz w:val="22"/>
           <w:szCs w:val="22"/>
         </w:rPr>
-        <w:t>, with proper sign-offs.</w:t>
+        <w:t xml:space="preserve">, with proper </w:t>
+      </w:r>
+      <w:proofErr w:type="gramStart"/>
+      <w:r>
+        <w:rPr>
+          <w:rFonts w:asciiTheme="minorHAnsi" w:hAnsiTheme="minorHAnsi"/>
+          <w:sz w:val="22"/>
+          <w:szCs w:val="22"/>
+        </w:rPr>
+        <w:t>sign-offs</w:t>
+      </w:r>
+      <w:proofErr w:type="gramEnd"/>
+      <w:r>
+        <w:rPr>
+          <w:rFonts w:asciiTheme="minorHAnsi" w:hAnsiTheme="minorHAnsi"/>
+          <w:sz w:val="22"/>
+          <w:szCs w:val="22"/>
+        </w:rPr>
+        <w:t>.</w:t>
       </w:r>
     </w:p>
     <w:p>
@@ -23255,7 +23208,7 @@
           <w:sz w:val="22"/>
           <w:szCs w:val="22"/>
         </w:rPr>
-        <w:t>Date:</w:t>
+        <w:t>Date: 26/05/2026</w:t>
       </w:r>
       <w:r>
         <w:rPr>
@@ -23828,7 +23781,23 @@
           <w:szCs w:val="22"/>
         </w:rPr>
         <w:br/>
-        <w:t>I understand that it is my responsibility to ensure compliance with Immigration, Refugees and Citizenship Canada (IRCC) regulations at all times, and to seek legal or immigration counsel if needed.</w:t>
+        <w:t xml:space="preserve">I understand that it is my responsibility to ensure compliance with Immigration, Refugees and Citizenship Canada (IRCC) regulations </w:t>
+      </w:r>
+      <w:proofErr w:type="gramStart"/>
+      <w:r>
+        <w:rPr>
+          <w:sz w:val="22"/>
+          <w:szCs w:val="22"/>
+        </w:rPr>
+        <w:t>at all times</w:t>
+      </w:r>
+      <w:proofErr w:type="gramEnd"/>
+      <w:r>
+        <w:rPr>
+          <w:sz w:val="22"/>
+          <w:szCs w:val="22"/>
+        </w:rPr>
+        <w:t>, and to seek legal or immigration counsel if needed.</w:t>
       </w:r>
     </w:p>
     <w:p>
@@ -23963,7 +23932,7 @@
           <w:sz w:val="22"/>
           <w:szCs w:val="22"/>
         </w:rPr>
-        <w:t xml:space="preserve">Date: </w:t>
+        <w:t xml:space="preserve">Date: 26/05/2026 </w:t>
       </w:r>
     </w:p>
     <w:p>
@@ -24337,8 +24306,8 @@
       </w:pPr>
     </w:p>
     <w:sectPr>
-      <w:headerReference w:type="default" r:id="rId11"/>
-      <w:footerReference w:type="default" r:id="rId12"/>
+      <w:headerReference w:type="default" r:id="rId9"/>
+      <w:footerReference w:type="default" r:id="rId10"/>
       <w:pgSz w:w="12240" w:h="15840"/>
       <w:pgMar w:top="720" w:right="720" w:bottom="432" w:left="720" w:header="720" w:footer="144" w:gutter="0"/>
       <w:cols w:space="720"/>
@@ -24549,7 +24518,33 @@
         <w:sz w:val="16"/>
         <w:szCs w:val="16"/>
       </w:rPr>
-      <w:t>25 Watline Ave, Unit 204, Mississauga</w:t>
+      <w:t xml:space="preserve">25 </w:t>
+    </w:r>
+    <w:proofErr w:type="spellStart"/>
+    <w:r>
+      <w:rPr>
+        <w:rFonts w:ascii="Arial" w:hAnsi="Arial" w:cs="Arial"/>
+        <w:b/>
+        <w:bCs/>
+        <w:i/>
+        <w:iCs/>
+        <w:sz w:val="16"/>
+        <w:szCs w:val="16"/>
+      </w:rPr>
+      <w:t>Watline</w:t>
+    </w:r>
+    <w:proofErr w:type="spellEnd"/>
+    <w:r>
+      <w:rPr>
+        <w:rFonts w:ascii="Arial" w:hAnsi="Arial" w:cs="Arial"/>
+        <w:b/>
+        <w:bCs/>
+        <w:i/>
+        <w:iCs/>
+        <w:sz w:val="16"/>
+        <w:szCs w:val="16"/>
+      </w:rPr>
+      <w:t xml:space="preserve"> Ave, Unit 204, Mississauga</w:t>
     </w:r>
     <w:r>
       <w:rPr>
@@ -27475,7 +27470,6 @@
   <w:style w:type="character" w:default="1" w:styleId="DefaultParagraphFont">
     <w:name w:val="Default Paragraph Font"/>
     <w:uiPriority w:val="1"/>
-    <w:semiHidden/>
     <w:unhideWhenUsed/>
   </w:style>
   <w:style w:type="table" w:default="1" w:styleId="TableNormal">

</xml_diff>